<commit_message>
fix: strip the baked-in sample photo from the PI starter; add a paste hint
The macroized Personal Information starter carried a real person's 1x1
photo inside its media. The picture cell is now a plain box with a gray
'(paste your 1x1 ID picture here)' hint — interns add their own photo
after downloading; no baked image ships in the file.
</commit_message>
<xml_diff>
--- a/public/documents/templates/personal-information-template.docx
+++ b/public/documents/templates/personal-information-template.docx
@@ -122,63 +122,11 @@
             </w:pPr>
             <w:r>
               <w:rPr>
-                <w:noProof/>
-              </w:rPr>
-              <w:drawing>
-                <wp:anchor distT="0" distB="0" distL="114300" distR="114300" simplePos="0" relativeHeight="251659264" behindDoc="0" locked="0" layoutInCell="1" allowOverlap="1" wp14:anchorId="5F8364EE" wp14:editId="4822CB32">
-                  <wp:simplePos x="0" y="0"/>
-                  <wp:positionH relativeFrom="column">
-                    <wp:posOffset>384810</wp:posOffset>
-                  </wp:positionH>
-                  <wp:positionV relativeFrom="paragraph">
-                    <wp:posOffset>2540</wp:posOffset>
-                  </wp:positionV>
-                  <wp:extent cx="1097280" cy="1097280"/>
-                  <wp:effectExtent l="0" t="0" r="7620" b="7620"/>
-                  <wp:wrapNone/>
-                  <wp:docPr id="2123977358" name="Picture 1"/>
-                  <wp:cNvGraphicFramePr>
-                    <a:graphicFrameLocks xmlns:a="http://schemas.openxmlformats.org/drawingml/2006/main" noChangeAspect="1"/>
-                  </wp:cNvGraphicFramePr>
-                  <a:graphic xmlns:a="http://schemas.openxmlformats.org/drawingml/2006/main">
-                    <a:graphicData uri="http://schemas.openxmlformats.org/drawingml/2006/picture">
-                      <pic:pic xmlns:pic="http://schemas.openxmlformats.org/drawingml/2006/picture">
-                        <pic:nvPicPr>
-                          <pic:cNvPr id="2123977358" name="Picture 2123977358"/>
-                          <pic:cNvPicPr/>
-                        </pic:nvPicPr>
-                        <pic:blipFill>
-                          <a:blip r:embed="rId6" cstate="print">
-                            <a:extLst>
-                              <a:ext uri="{28A0092B-C50C-407E-A947-70E740481C1C}">
-                                <a14:useLocalDpi xmlns:a14="http://schemas.microsoft.com/office/drawing/2010/main" val="0"/>
-                              </a:ext>
-                            </a:extLst>
-                          </a:blip>
-                          <a:stretch>
-                            <a:fillRect/>
-                          </a:stretch>
-                        </pic:blipFill>
-                        <pic:spPr>
-                          <a:xfrm>
-                            <a:off x="0" y="0"/>
-                            <a:ext cx="1097280" cy="1097280"/>
-                          </a:xfrm>
-                          <a:prstGeom prst="rect">
-                            <a:avLst/>
-                          </a:prstGeom>
-                        </pic:spPr>
-                      </pic:pic>
-                    </a:graphicData>
-                  </a:graphic>
-                  <wp14:sizeRelH relativeFrom="margin">
-                    <wp14:pctWidth>0</wp14:pctWidth>
-                  </wp14:sizeRelH>
-                  <wp14:sizeRelV relativeFrom="margin">
-                    <wp14:pctHeight>0</wp14:pctHeight>
-                  </wp14:sizeRelV>
-                </wp:anchor>
-              </w:drawing>
+                <w:i/>
+                <w:color w:val="9CA3AF"/>
+                <w:sz w:val="16"/>
+              </w:rPr>
+              <w:t xml:space="preserve">(paste your 1x1 ID picture here)</w:t>
             </w:r>
           </w:p>
           <w:p>
@@ -307,7 +255,7 @@
                 <w:sz w:val="20"/>
                 <w:szCs w:val="20"/>
               </w:rPr>
-              <w:t xml:space="preserve">${last_name}</w:t>
+              <w:t>${last_name}</w:t>
             </w:r>
           </w:p>
         </w:tc>
@@ -347,7 +295,7 @@
                 <w:sz w:val="20"/>
                 <w:szCs w:val="20"/>
               </w:rPr>
-              <w:t xml:space="preserve">${first_name}</w:t>
+              <w:t>${first_name}</w:t>
             </w:r>
           </w:p>
         </w:tc>
@@ -378,7 +326,7 @@
                 <w:sz w:val="20"/>
                 <w:szCs w:val="20"/>
               </w:rPr>
-              <w:t xml:space="preserve"> </w:t>
+              <w:t xml:space="preserve"> ${</w:t>
             </w:r>
             <w:proofErr w:type="spellStart"/>
             <w:r>
@@ -387,9 +335,17 @@
                 <w:sz w:val="20"/>
                 <w:szCs w:val="20"/>
               </w:rPr>
-              <w:t>${middle_name}</w:t>
+              <w:t>middle_name</w:t>
             </w:r>
             <w:proofErr w:type="spellEnd"/>
+            <w:r>
+              <w:rPr>
+                <w:rFonts w:ascii="Arial" w:hAnsi="Arial" w:cs="Arial"/>
+                <w:sz w:val="20"/>
+                <w:szCs w:val="20"/>
+              </w:rPr>
+              <w:t>}</w:t>
+            </w:r>
           </w:p>
         </w:tc>
       </w:tr>
@@ -418,14 +374,6 @@
               </w:rPr>
               <w:t>Age: ${age}</w:t>
             </w:r>
-            <w:r>
-              <w:rPr>
-                <w:rFonts w:ascii="Arial" w:hAnsi="Arial" w:cs="Arial"/>
-                <w:sz w:val="20"/>
-                <w:szCs w:val="20"/>
-              </w:rPr>
-              <w:t xml:space="preserve"/>
-            </w:r>
           </w:p>
         </w:tc>
         <w:tc>
@@ -449,88 +397,6 @@
                 <w:szCs w:val="20"/>
               </w:rPr>
               <w:t>Sex: ${sex}</w:t>
-            </w:r>
-            <w:r>
-              <w:rPr>
-                <w:rFonts w:ascii="Arial" w:hAnsi="Arial" w:cs="Arial"/>
-                <w:sz w:val="20"/>
-                <w:szCs w:val="20"/>
-              </w:rPr>
-              <w:t xml:space="preserve"/>
-            </w:r>
-            <w:r>
-              <w:rPr>
-                <w:rFonts w:ascii="Arial" w:hAnsi="Arial" w:cs="Arial"/>
-                <w:sz w:val="20"/>
-                <w:szCs w:val="20"/>
-              </w:rPr>
-              <w:t/>
-            </w:r>
-            <w:r>
-              <w:rPr>
-                <w:rFonts w:ascii="Segoe UI Symbol" w:hAnsi="Segoe UI Symbol" w:cs="Segoe UI Symbol"/>
-                <w:sz w:val="20"/>
-                <w:szCs w:val="20"/>
-              </w:rPr>
-              <w:t/>
-            </w:r>
-            <w:r>
-              <w:rPr>
-                <w:rFonts w:ascii="Arial" w:hAnsi="Arial" w:cs="Arial"/>
-                <w:sz w:val="20"/>
-                <w:szCs w:val="20"/>
-              </w:rPr>
-              <w:t/>
-            </w:r>
-            <w:r>
-              <w:rPr>
-                <w:rFonts w:ascii="Arial" w:hAnsi="Arial" w:cs="Arial"/>
-                <w:sz w:val="20"/>
-                <w:szCs w:val="20"/>
-              </w:rPr>
-              <w:t xml:space="preserve"/>
-            </w:r>
-            <w:proofErr w:type="gramStart"/>
-            <w:r>
-              <w:rPr>
-                <w:rFonts w:ascii="Arial" w:hAnsi="Arial" w:cs="Arial"/>
-                <w:sz w:val="20"/>
-                <w:szCs w:val="20"/>
-              </w:rPr>
-              <w:t xml:space="preserve"/>
-            </w:r>
-            <w:r>
-              <w:rPr>
-                <w:rFonts w:ascii="Arial" w:hAnsi="Arial" w:cs="Arial"/>
-                <w:sz w:val="20"/>
-                <w:szCs w:val="20"/>
-              </w:rPr>
-              <w:t xml:space="preserve"/>
-            </w:r>
-            <w:proofErr w:type="gramEnd"/>
-            <w:r>
-              <w:rPr>
-                <w:rFonts w:ascii="Arial" w:hAnsi="Arial" w:cs="Arial"/>
-                <w:sz w:val="20"/>
-                <w:szCs w:val="20"/>
-              </w:rPr>
-              <w:t xml:space="preserve"/>
-            </w:r>
-            <w:r>
-              <w:rPr>
-                <w:rFonts w:ascii="Arial" w:hAnsi="Arial" w:cs="Arial"/>
-                <w:sz w:val="20"/>
-                <w:szCs w:val="20"/>
-              </w:rPr>
-              <w:t xml:space="preserve"/>
-            </w:r>
-            <w:r>
-              <w:rPr>
-                <w:rFonts w:ascii="Arial" w:hAnsi="Arial" w:cs="Arial"/>
-                <w:sz w:val="20"/>
-                <w:szCs w:val="20"/>
-              </w:rPr>
-              <w:t/>
             </w:r>
           </w:p>
         </w:tc>
@@ -574,7 +440,7 @@
                 <w:sz w:val="20"/>
                 <w:szCs w:val="20"/>
               </w:rPr>
-              <w:t xml:space="preserve">${height}</w:t>
+              <w:t>${height}</w:t>
             </w:r>
           </w:p>
         </w:tc>
@@ -614,7 +480,7 @@
                 <w:sz w:val="20"/>
                 <w:szCs w:val="20"/>
               </w:rPr>
-              <w:t xml:space="preserve">${weight}</w:t>
+              <w:t>${weight}</w:t>
             </w:r>
           </w:p>
         </w:tc>
@@ -645,7 +511,7 @@
                 <w:sz w:val="20"/>
                 <w:szCs w:val="20"/>
               </w:rPr>
-              <w:t xml:space="preserve">${complexion}</w:t>
+              <w:t>${complexion}</w:t>
             </w:r>
           </w:p>
         </w:tc>
@@ -711,15 +577,7 @@
                 <w:sz w:val="20"/>
                 <w:szCs w:val="20"/>
               </w:rPr>
-              <w:t xml:space="preserve">${birthdate}</w:t>
-            </w:r>
-            <w:r>
-              <w:rPr>
-                <w:rFonts w:ascii="Arial" w:hAnsi="Arial" w:cs="Arial"/>
-                <w:sz w:val="20"/>
-                <w:szCs w:val="20"/>
-              </w:rPr>
-              <w:t/>
+              <w:t>${birthdate}</w:t>
             </w:r>
           </w:p>
         </w:tc>
@@ -744,14 +602,6 @@
                 <w:szCs w:val="20"/>
               </w:rPr>
               <w:t>Birth Place: ${birth_place}</w:t>
-            </w:r>
-            <w:r>
-              <w:rPr>
-                <w:rFonts w:ascii="Arial" w:hAnsi="Arial" w:cs="Arial"/>
-                <w:sz w:val="20"/>
-                <w:szCs w:val="20"/>
-              </w:rPr>
-              <w:t xml:space="preserve"/>
             </w:r>
           </w:p>
         </w:tc>
@@ -788,7 +638,7 @@
                 <w:sz w:val="20"/>
                 <w:szCs w:val="20"/>
               </w:rPr>
-              <w:t xml:space="preserve">${citizenship}</w:t>
+              <w:t>${citizenship}</w:t>
             </w:r>
           </w:p>
         </w:tc>
@@ -820,7 +670,7 @@
                 <w:sz w:val="20"/>
                 <w:szCs w:val="20"/>
               </w:rPr>
-              <w:t xml:space="preserve">${civil_status}</w:t>
+              <w:t>${civil_status}</w:t>
             </w:r>
           </w:p>
         </w:tc>
@@ -857,7 +707,7 @@
                 <w:sz w:val="20"/>
                 <w:szCs w:val="20"/>
               </w:rPr>
-              <w:t xml:space="preserve"> </w:t>
+              <w:t xml:space="preserve"> ${</w:t>
             </w:r>
             <w:proofErr w:type="spellStart"/>
             <w:r>
@@ -866,7 +716,7 @@
                 <w:sz w:val="20"/>
                 <w:szCs w:val="20"/>
               </w:rPr>
-              <w:t>${present_address}</w:t>
+              <w:t>present_address</w:t>
             </w:r>
             <w:proofErr w:type="spellEnd"/>
             <w:r>
@@ -875,7 +725,7 @@
                 <w:sz w:val="20"/>
                 <w:szCs w:val="20"/>
               </w:rPr>
-              <w:t/>
+              <w:t>}</w:t>
             </w:r>
           </w:p>
         </w:tc>
@@ -907,7 +757,7 @@
                 <w:sz w:val="20"/>
                 <w:szCs w:val="20"/>
               </w:rPr>
-              <w:t xml:space="preserve">${present_contact}</w:t>
+              <w:t>${present_contact}</w:t>
             </w:r>
           </w:p>
         </w:tc>
@@ -944,7 +794,7 @@
                 <w:sz w:val="20"/>
                 <w:szCs w:val="20"/>
               </w:rPr>
-              <w:t xml:space="preserve"> </w:t>
+              <w:t xml:space="preserve"> ${</w:t>
             </w:r>
             <w:proofErr w:type="spellStart"/>
             <w:r>
@@ -953,7 +803,7 @@
                 <w:sz w:val="20"/>
                 <w:szCs w:val="20"/>
               </w:rPr>
-              <w:t>${permanent_address}</w:t>
+              <w:t>permanent_address</w:t>
             </w:r>
             <w:proofErr w:type="spellEnd"/>
             <w:r>
@@ -962,7 +812,7 @@
                 <w:sz w:val="20"/>
                 <w:szCs w:val="20"/>
               </w:rPr>
-              <w:t/>
+              <w:t>}</w:t>
             </w:r>
           </w:p>
         </w:tc>
@@ -994,7 +844,7 @@
                 <w:sz w:val="20"/>
                 <w:szCs w:val="20"/>
               </w:rPr>
-              <w:t xml:space="preserve">${permanent_contact}</w:t>
+              <w:t>${permanent_contact}</w:t>
             </w:r>
           </w:p>
         </w:tc>
@@ -1081,7 +931,7 @@
                 <w:sz w:val="20"/>
                 <w:szCs w:val="20"/>
               </w:rPr>
-              <w:t xml:space="preserve"> </w:t>
+              <w:t xml:space="preserve"> ${</w:t>
             </w:r>
             <w:proofErr w:type="spellStart"/>
             <w:r>
@@ -1090,7 +940,7 @@
                 <w:sz w:val="20"/>
                 <w:szCs w:val="20"/>
               </w:rPr>
-              <w:t>${father_name}</w:t>
+              <w:t>father_name</w:t>
             </w:r>
             <w:proofErr w:type="spellEnd"/>
             <w:r>
@@ -1099,7 +949,7 @@
                 <w:sz w:val="20"/>
                 <w:szCs w:val="20"/>
               </w:rPr>
-              <w:t xml:space="preserve"/>
+              <w:t>}</w:t>
             </w:r>
           </w:p>
         </w:tc>
@@ -1131,7 +981,7 @@
                 <w:sz w:val="20"/>
                 <w:szCs w:val="20"/>
               </w:rPr>
-              <w:t xml:space="preserve">${father_occupation}</w:t>
+              <w:t>${father_occupation}</w:t>
             </w:r>
           </w:p>
         </w:tc>
@@ -1168,36 +1018,8 @@
                 <w:sz w:val="20"/>
                 <w:szCs w:val="20"/>
               </w:rPr>
-              <w:t xml:space="preserve">${mother_name}</w:t>
-            </w:r>
-            <w:proofErr w:type="spellStart"/>
-            <w:r>
-              <w:rPr>
-                <w:rFonts w:ascii="Arial" w:hAnsi="Arial" w:cs="Arial"/>
-                <w:sz w:val="20"/>
-                <w:szCs w:val="20"/>
-              </w:rPr>
-              <w:t/>
-            </w:r>
-            <w:proofErr w:type="spellEnd"/>
-            <w:r>
-              <w:rPr>
-                <w:rFonts w:ascii="Arial" w:hAnsi="Arial" w:cs="Arial"/>
-                <w:sz w:val="20"/>
-                <w:szCs w:val="20"/>
-              </w:rPr>
-              <w:t/>
-            </w:r>
-            <w:proofErr w:type="spellStart"/>
-            <w:r>
-              <w:rPr>
-                <w:rFonts w:ascii="Arial" w:hAnsi="Arial" w:cs="Arial"/>
-                <w:sz w:val="20"/>
-                <w:szCs w:val="20"/>
-              </w:rPr>
-              <w:t/>
-            </w:r>
-            <w:proofErr w:type="spellEnd"/>
+              <w:t>${mother_name}</w:t>
+            </w:r>
           </w:p>
         </w:tc>
         <w:tc>
@@ -1228,7 +1050,7 @@
                 <w:sz w:val="20"/>
                 <w:szCs w:val="20"/>
               </w:rPr>
-              <w:t xml:space="preserve">${mother_occupation}</w:t>
+              <w:t>${mother_occupation}</w:t>
             </w:r>
           </w:p>
         </w:tc>
@@ -1275,7 +1097,7 @@
                 <w:szCs w:val="20"/>
                 <w14:ligatures w14:val="none"/>
               </w:rPr>
-              <w:t xml:space="preserve"> </w:t>
+              <w:t xml:space="preserve"> ${</w:t>
             </w:r>
             <w:proofErr w:type="spellStart"/>
             <w:r>
@@ -1286,7 +1108,7 @@
                 <w:szCs w:val="20"/>
                 <w14:ligatures w14:val="none"/>
               </w:rPr>
-              <w:t>${parents_address}</w:t>
+              <w:t>parents_address</w:t>
             </w:r>
             <w:proofErr w:type="spellEnd"/>
             <w:r>
@@ -1297,7 +1119,7 @@
                 <w:szCs w:val="20"/>
                 <w14:ligatures w14:val="none"/>
               </w:rPr>
-              <w:t/>
+              <w:t>}</w:t>
             </w:r>
           </w:p>
         </w:tc>
@@ -1329,23 +1151,7 @@
                 <w:sz w:val="20"/>
                 <w:szCs w:val="20"/>
               </w:rPr>
-              <w:t xml:space="preserve">${parents_contact}</w:t>
-            </w:r>
-            <w:r>
-              <w:rPr>
-                <w:rFonts w:ascii="Arial" w:hAnsi="Arial" w:cs="Arial"/>
-                <w:sz w:val="20"/>
-                <w:szCs w:val="20"/>
-              </w:rPr>
-              <w:t/>
-            </w:r>
-            <w:r>
-              <w:rPr>
-                <w:rFonts w:ascii="Arial" w:hAnsi="Arial" w:cs="Arial"/>
-                <w:sz w:val="20"/>
-                <w:szCs w:val="20"/>
-              </w:rPr>
-              <w:t/>
+              <w:t>${parents_contact}</w:t>
             </w:r>
           </w:p>
         </w:tc>
@@ -1382,36 +1188,8 @@
                 <w:sz w:val="20"/>
                 <w:szCs w:val="20"/>
               </w:rPr>
-              <w:t xml:space="preserve">${guardian_name}</w:t>
-            </w:r>
-            <w:proofErr w:type="spellStart"/>
-            <w:r>
-              <w:rPr>
-                <w:rFonts w:ascii="Arial" w:hAnsi="Arial" w:cs="Arial"/>
-                <w:sz w:val="20"/>
-                <w:szCs w:val="20"/>
-              </w:rPr>
-              <w:t/>
-            </w:r>
-            <w:proofErr w:type="spellEnd"/>
-            <w:r>
-              <w:rPr>
-                <w:rFonts w:ascii="Arial" w:hAnsi="Arial" w:cs="Arial"/>
-                <w:sz w:val="20"/>
-                <w:szCs w:val="20"/>
-              </w:rPr>
-              <w:t/>
-            </w:r>
-            <w:proofErr w:type="spellStart"/>
-            <w:r>
-              <w:rPr>
-                <w:rFonts w:ascii="Arial" w:hAnsi="Arial" w:cs="Arial"/>
-                <w:sz w:val="20"/>
-                <w:szCs w:val="20"/>
-              </w:rPr>
-              <w:t/>
-            </w:r>
-            <w:proofErr w:type="spellEnd"/>
+              <w:t>${guardian_name}</w:t>
+            </w:r>
           </w:p>
         </w:tc>
         <w:tc>
@@ -1442,7 +1220,7 @@
                 <w:sz w:val="20"/>
                 <w:szCs w:val="20"/>
               </w:rPr>
-              <w:t xml:space="preserve">${guardian_contact}</w:t>
+              <w:t>${guardian_contact}</w:t>
             </w:r>
           </w:p>
         </w:tc>
@@ -1513,15 +1291,7 @@
                 <w:sz w:val="20"/>
                 <w:szCs w:val="20"/>
               </w:rPr>
-              <w:t xml:space="preserve">${course_name}</w:t>
-            </w:r>
-            <w:r>
-              <w:rPr>
-                <w:rFonts w:ascii="Arial" w:hAnsi="Arial" w:cs="Arial"/>
-                <w:sz w:val="20"/>
-                <w:szCs w:val="20"/>
-              </w:rPr>
-              <w:t/>
+              <w:t>${course_name}</w:t>
             </w:r>
           </w:p>
         </w:tc>
@@ -1553,7 +1323,7 @@
                 <w:sz w:val="20"/>
                 <w:szCs w:val="20"/>
               </w:rPr>
-              <w:t xml:space="preserve">${year_level_word} Year</w:t>
+              <w:t>${year_level_word} Year</w:t>
             </w:r>
           </w:p>
         </w:tc>
@@ -1630,14 +1400,6 @@
                 <w:sz w:val="20"/>
                 <w:szCs w:val="20"/>
               </w:rPr>
-              <w:t xml:space="preserve"/>
-            </w:r>
-            <w:r>
-              <w:rPr>
-                <w:rFonts w:ascii="Arial" w:hAnsi="Arial" w:cs="Arial"/>
-                <w:sz w:val="20"/>
-                <w:szCs w:val="20"/>
-              </w:rPr>
               <w:t>${coordinator_contact}</w:t>
             </w:r>
           </w:p>
@@ -1867,36 +1629,8 @@
                 <w:sz w:val="20"/>
                 <w:szCs w:val="20"/>
               </w:rPr>
-              <w:t xml:space="preserve">${emergency_name}</w:t>
-            </w:r>
-            <w:proofErr w:type="spellStart"/>
-            <w:r>
-              <w:rPr>
-                <w:rFonts w:ascii="Arial" w:hAnsi="Arial" w:cs="Arial"/>
-                <w:sz w:val="20"/>
-                <w:szCs w:val="20"/>
-              </w:rPr>
-              <w:t/>
-            </w:r>
-            <w:proofErr w:type="spellEnd"/>
-            <w:r>
-              <w:rPr>
-                <w:rFonts w:ascii="Arial" w:hAnsi="Arial" w:cs="Arial"/>
-                <w:sz w:val="20"/>
-                <w:szCs w:val="20"/>
-              </w:rPr>
-              <w:t/>
-            </w:r>
-            <w:proofErr w:type="spellStart"/>
-            <w:r>
-              <w:rPr>
-                <w:rFonts w:ascii="Arial" w:hAnsi="Arial" w:cs="Arial"/>
-                <w:sz w:val="20"/>
-                <w:szCs w:val="20"/>
-              </w:rPr>
-              <w:t/>
-            </w:r>
-            <w:proofErr w:type="spellEnd"/>
+              <w:t>${emergency_name}</w:t>
+            </w:r>
           </w:p>
         </w:tc>
         <w:tc>
@@ -1927,7 +1661,7 @@
                 <w:sz w:val="20"/>
                 <w:szCs w:val="20"/>
               </w:rPr>
-              <w:t xml:space="preserve">${emergency_relationship}</w:t>
+              <w:t>${emergency_relationship}</w:t>
             </w:r>
           </w:p>
         </w:tc>
@@ -1966,6 +1700,16 @@
               </w:rPr>
               <w:t xml:space="preserve"> </w:t>
             </w:r>
+            <w:r>
+              <w:rPr>
+                <w:rFonts w:ascii="Arial" w:hAnsi="Arial" w:cs="Arial"/>
+                <w:kern w:val="0"/>
+                <w:sz w:val="20"/>
+                <w:szCs w:val="20"/>
+                <w14:ligatures w14:val="none"/>
+              </w:rPr>
+              <w:t>${</w:t>
+            </w:r>
             <w:proofErr w:type="spellStart"/>
             <w:r>
               <w:rPr>
@@ -1975,7 +1719,7 @@
                 <w:szCs w:val="20"/>
                 <w14:ligatures w14:val="none"/>
               </w:rPr>
-              <w:t>${emergency_address}</w:t>
+              <w:t>emergency_address</w:t>
             </w:r>
             <w:proofErr w:type="spellEnd"/>
             <w:r>
@@ -1986,7 +1730,7 @@
                 <w:szCs w:val="20"/>
                 <w14:ligatures w14:val="none"/>
               </w:rPr>
-              <w:t/>
+              <w:t>}</w:t>
             </w:r>
           </w:p>
         </w:tc>
@@ -2018,7 +1762,7 @@
                 <w:sz w:val="20"/>
                 <w:szCs w:val="20"/>
               </w:rPr>
-              <w:t xml:space="preserve">${emergency_contact}</w:t>
+              <w:t>${emergency_contact}</w:t>
             </w:r>
           </w:p>
         </w:tc>
@@ -2189,7 +1933,7 @@
       </w:r>
     </w:p>
     <w:sectPr>
-      <w:headerReference w:type="default" r:id="rId7"/>
+      <w:headerReference w:type="default" r:id="rId6"/>
       <w:pgSz w:w="12240" w:h="18720"/>
       <w:pgMar w:top="720" w:right="1080" w:bottom="720" w:left="1080" w:header="720" w:footer="720" w:gutter="0"/>
       <w:cols w:space="720"/>
@@ -2257,150 +2001,51 @@
     </w:pPr>
     <w:r>
       <w:rPr>
-        <w:rFonts w:ascii="Arial Narrow" w:hAnsi="Arial Narrow"/>
         <w:noProof/>
-        <w:sz w:val="24"/>
       </w:rPr>
-      <mc:AlternateContent>
-        <mc:Choice Requires="wpg">
-          <w:drawing>
-            <wp:anchor distT="0" distB="0" distL="114300" distR="114300" simplePos="0" relativeHeight="251659264" behindDoc="1" locked="0" layoutInCell="1" allowOverlap="1" wp14:anchorId="4C4F7254" wp14:editId="63812E72">
-              <wp:simplePos x="0" y="0"/>
-              <wp:positionH relativeFrom="column">
-                <wp:posOffset>304800</wp:posOffset>
-              </wp:positionH>
-              <wp:positionV relativeFrom="paragraph">
-                <wp:posOffset>38100</wp:posOffset>
-              </wp:positionV>
-              <wp:extent cx="6080760" cy="701040"/>
-              <wp:effectExtent l="0" t="0" r="0" b="3810"/>
-              <wp:wrapNone/>
-              <wp:docPr id="927776850" name="Group 3"/>
-              <wp:cNvGraphicFramePr/>
-              <a:graphic xmlns:a="http://schemas.openxmlformats.org/drawingml/2006/main">
-                <a:graphicData uri="http://schemas.microsoft.com/office/word/2010/wordprocessingGroup">
-                  <wpg:wgp>
-                    <wpg:cNvGrpSpPr/>
-                    <wpg:grpSpPr>
-                      <a:xfrm>
-                        <a:off x="0" y="0"/>
-                        <a:ext cx="6080760" cy="701040"/>
-                        <a:chOff x="0" y="0"/>
-                        <a:chExt cx="6080760" cy="701040"/>
-                      </a:xfrm>
-                    </wpg:grpSpPr>
-                    <pic:pic xmlns:pic="http://schemas.openxmlformats.org/drawingml/2006/picture">
-                      <pic:nvPicPr>
-                        <pic:cNvPr id="751649781" name="Picture 2026602129"/>
-                        <pic:cNvPicPr>
-                          <a:picLocks noChangeAspect="1"/>
-                        </pic:cNvPicPr>
-                      </pic:nvPicPr>
-                      <pic:blipFill rotWithShape="1">
-                        <a:blip r:embed="rId1">
-                          <a:extLst>
-                            <a:ext uri="{28A0092B-C50C-407E-A947-70E740481C1C}">
-                              <a14:useLocalDpi xmlns:a14="http://schemas.microsoft.com/office/drawing/2010/main" val="0"/>
-                            </a:ext>
-                          </a:extLst>
-                        </a:blip>
-                        <a:srcRect l="81492" r="3457"/>
-                        <a:stretch/>
-                      </pic:blipFill>
-                      <pic:spPr bwMode="auto">
-                        <a:xfrm>
-                          <a:off x="5303520" y="0"/>
-                          <a:ext cx="777240" cy="592455"/>
-                        </a:xfrm>
-                        <a:prstGeom prst="rect">
-                          <a:avLst/>
-                        </a:prstGeom>
-                        <a:noFill/>
-                        <a:ln>
-                          <a:noFill/>
-                        </a:ln>
-                        <a:extLst>
-                          <a:ext uri="{53640926-AAD7-44D8-BBD7-CCE9431645EC}">
-                            <a14:shadowObscured xmlns:a14="http://schemas.microsoft.com/office/drawing/2010/main"/>
-                          </a:ext>
-                        </a:extLst>
-                      </pic:spPr>
-                    </pic:pic>
-                    <pic:pic xmlns:pic="http://schemas.openxmlformats.org/drawingml/2006/picture">
-                      <pic:nvPicPr>
-                        <pic:cNvPr id="1059337313" name="Picture 122874711" descr="C:\Users\CSIT\Downloads\QDApXBoJ.jpg"/>
-                        <pic:cNvPicPr>
-                          <a:picLocks noChangeAspect="1"/>
-                        </pic:cNvPicPr>
-                      </pic:nvPicPr>
-                      <pic:blipFill rotWithShape="1">
-                        <a:blip r:embed="rId2">
-                          <a:extLst>
-                            <a:ext uri="{28A0092B-C50C-407E-A947-70E740481C1C}">
-                              <a14:useLocalDpi xmlns:a14="http://schemas.microsoft.com/office/drawing/2010/main" val="0"/>
-                            </a:ext>
-                          </a:extLst>
-                        </a:blip>
-                        <a:srcRect r="10770"/>
-                        <a:stretch/>
-                      </pic:blipFill>
-                      <pic:spPr bwMode="auto">
-                        <a:xfrm>
-                          <a:off x="0" y="0"/>
-                          <a:ext cx="5303520" cy="701040"/>
-                        </a:xfrm>
-                        <a:prstGeom prst="rect">
-                          <a:avLst/>
-                        </a:prstGeom>
-                        <a:noFill/>
-                        <a:ln>
-                          <a:noFill/>
-                        </a:ln>
-                        <a:extLst>
-                          <a:ext uri="{53640926-AAD7-44D8-BBD7-CCE9431645EC}">
-                            <a14:shadowObscured xmlns:a14="http://schemas.microsoft.com/office/drawing/2010/main"/>
-                          </a:ext>
-                        </a:extLst>
-                      </pic:spPr>
-                    </pic:pic>
-                  </wpg:wgp>
-                </a:graphicData>
-              </a:graphic>
-            </wp:anchor>
-          </w:drawing>
-        </mc:Choice>
-        <mc:Fallback xmlns:w16sdtfl="http://schemas.microsoft.com/office/word/2024/wordml/sdtformatlock">
-          <w:pict>
-            <v:group w14:anchorId="3A5955FC" id="Group 3" o:spid="_x0000_s1026" style="position:absolute;margin-left:24pt;margin-top:3pt;width:478.8pt;height:55.2pt;z-index:-251657216" coordsize="60807,7010" o:gfxdata="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">
-              <v:shapetype id="_x0000_t75" coordsize="21600,21600" o:spt="75" o:preferrelative="t" path="m@4@5l@4@11@9@11@9@5xe" filled="f" stroked="f">
-                <v:stroke joinstyle="miter"/>
-                <v:formulas>
-                  <v:f eqn="if lineDrawn pixelLineWidth 0"/>
-                  <v:f eqn="sum @0 1 0"/>
-                  <v:f eqn="sum 0 0 @1"/>
-                  <v:f eqn="prod @2 1 2"/>
-                  <v:f eqn="prod @3 21600 pixelWidth"/>
-                  <v:f eqn="prod @3 21600 pixelHeight"/>
-                  <v:f eqn="sum @0 0 1"/>
-                  <v:f eqn="prod @6 1 2"/>
-                  <v:f eqn="prod @7 21600 pixelWidth"/>
-                  <v:f eqn="sum @8 21600 0"/>
-                  <v:f eqn="prod @7 21600 pixelHeight"/>
-                  <v:f eqn="sum @10 21600 0"/>
-                </v:formulas>
-                <v:path o:extrusionok="f" gradientshapeok="t" o:connecttype="rect"/>
-                <o:lock v:ext="edit" aspectratio="t"/>
-              </v:shapetype>
-              <v:shape id="Picture 2026602129" o:spid="_x0000_s1027" type="#_x0000_t75" style="position:absolute;left:53035;width:7772;height:5924;visibility:visible;mso-wrap-style:square" o:gfxdata="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">
-                <v:imagedata r:id="rId3" o:title="" cropleft="53407f" cropright="2266f"/>
-              </v:shape>
-              <v:shape id="Picture 122874711" o:spid="_x0000_s1028" type="#_x0000_t75" style="position:absolute;width:53035;height:7010;visibility:visible;mso-wrap-style:square" o:gfxdata="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">
-                <v:imagedata r:id="rId4" o:title="QDApXBoJ" cropright="7058f"/>
-              </v:shape>
-            </v:group>
-          </w:pict>
-        </mc:Fallback>
-      </mc:AlternateContent>
+      <w:drawing>
+        <wp:anchor distT="0" distB="0" distL="114300" distR="114300" simplePos="0" relativeHeight="251659264" behindDoc="1" locked="0" layoutInCell="1" allowOverlap="1" wp14:anchorId="21B0EFDC" wp14:editId="7DEE83F3">
+          <wp:simplePos x="0" y="0"/>
+          <wp:positionH relativeFrom="margin">
+            <wp:align>center</wp:align>
+          </wp:positionH>
+          <wp:positionV relativeFrom="paragraph">
+            <wp:posOffset>0</wp:posOffset>
+          </wp:positionV>
+          <wp:extent cx="5942330" cy="732790"/>
+          <wp:effectExtent l="0" t="0" r="1270" b="0"/>
+          <wp:wrapNone/>
+          <wp:docPr id="828425375" name="Picture 1"/>
+          <wp:cNvGraphicFramePr>
+            <a:graphicFrameLocks xmlns:a="http://schemas.openxmlformats.org/drawingml/2006/main" noChangeAspect="1"/>
+          </wp:cNvGraphicFramePr>
+          <a:graphic xmlns:a="http://schemas.openxmlformats.org/drawingml/2006/main">
+            <a:graphicData uri="http://schemas.openxmlformats.org/drawingml/2006/picture">
+              <pic:pic xmlns:pic="http://schemas.openxmlformats.org/drawingml/2006/picture">
+                <pic:nvPicPr>
+                  <pic:cNvPr id="828425375" name=""/>
+                  <pic:cNvPicPr/>
+                </pic:nvPicPr>
+                <pic:blipFill>
+                  <a:blip r:embed="rId1"/>
+                  <a:stretch>
+                    <a:fillRect/>
+                  </a:stretch>
+                </pic:blipFill>
+                <pic:spPr>
+                  <a:xfrm>
+                    <a:off x="0" y="0"/>
+                    <a:ext cx="5942330" cy="732790"/>
+                  </a:xfrm>
+                  <a:prstGeom prst="rect">
+                    <a:avLst/>
+                  </a:prstGeom>
+                </pic:spPr>
+              </pic:pic>
+            </a:graphicData>
+          </a:graphic>
+        </wp:anchor>
+      </w:drawing>
     </w:r>
   </w:p>
 </w:hdr>

</xml_diff>